<commit_message>
Add machine-derived reviewer result display and README verification
</commit_message>
<xml_diff>
--- a/paper_update/From_Risk_Register_to_Runtime_Predicate_IEEE_SUBMISSION.docx
+++ b/paper_update/From_Risk_Register_to_Runtime_Predicate_IEEE_SUBMISSION.docx
@@ -14351,7 +14351,7 @@
         <w:rPr>
           <w:rtl w:val="0"/>
         </w:rPr>
-        <w:t xml:space="preserve">The GC-IR schema, reference implementations of Ψ_K tooling and Φ, the Control Derivation Catalog, both case artifact sets (Steps 1–5 inputs, judgment records, dispositions, specifications, compiled bundles, lifecycle-registry fixtures), coverage and temporal-validity queries, the adjudication instrument, and the preregistration commitment are released as a hash-pinned tagged release per Appendix C, at https://github.com/Sukhmangill977/gc-ir-reference, release tag v1.0.2, under the MIT licence. The repository contains the GC-IR JSON Schemas; the Ψ_K tooling and the Φ reference implementation; the Control Derivation Catalogs; the Steps 1–5 serialized inputs, signed judgment records, dispositions and Approved Control Specifications for both cases; the compiled bundles and lifecycle-registry fixtures; the unit, property-based, adversarial and integration test suites; the coverage and temporal-validity queries; the determinism results; the Monte Carlo analysis; the Case B predicate-family mapping; the campaign provenance record; and the frozen, deferred RQ5 protocol. The public preregistration freeze is tag preregister-tier0-v2.2 at commit c44f25d6fdb67e0bc4ac73a6217125dec8da1c0e. The held-out expert-study register is withheld until study close, then released with the study data. An archival deposit with a persistent identifier is pending and is not cited here; the repository release tag and its hash manifest are the citable artifact until one exists.</w:t>
+        <w:t xml:space="preserve">The GC-IR schema, reference implementations of Ψ_K tooling and Φ, the Control Derivation Catalog, both case artifact sets (Steps 1–5 inputs, judgment records, dispositions, specifications, compiled bundles, lifecycle-registry fixtures), coverage and temporal-validity queries, the adjudication instrument, and the preregistration commitment are released as a hash-pinned tagged release per Appendix C, at https://github.com/Sukhmangill977/gc-ir-reference, release tag v1.0.3, under the MIT licence. The repository contains the GC-IR JSON Schemas; the Ψ_K tooling and the Φ reference implementation; the Control Derivation Catalogs; the Steps 1–5 serialized inputs, signed judgment records, dispositions and Approved Control Specifications for both cases; the compiled bundles and lifecycle-registry fixtures; the unit, property-based, adversarial and integration test suites; the coverage and temporal-validity queries; the determinism results; the Monte Carlo analysis; the Case B predicate-family mapping; the campaign provenance record; and the frozen, deferred RQ5 protocol. The public preregistration freeze is tag preregister-tier0-v2.2 at commit c44f25d6fdb67e0bc4ac73a6217125dec8da1c0e. The held-out expert-study register is withheld until study close, then released with the study data. An archival deposit with a persistent identifier is pending and is not cited here; the repository release tag and its hash manifest are the citable artifact until one exists.</w:t>
       </w:r>
     </w:p>
     <w:p ns1:paraId="000001F4">
@@ -15926,7 +15926,7 @@
         <w:rPr>
           <w:rtl w:val="0"/>
         </w:rPr>
-        <w:t xml:space="preserve"> release tree within it or as a sibling repository under the same organization, named in the release notes; MIT license for code and schema, per that precedent. The artifact is released at https://github.com/Sukhmangill977/gc-ir-reference, release tag v1.0.2.</w:t>
+        <w:t xml:space="preserve"> release tree within it or as a sibling repository under the same organization, named in the release notes; MIT license for code and schema, per that precedent. The artifact is released at https://github.com/Sukhmangill977/gc-ir-reference, release tag v1.0.3.</w:t>
       </w:r>
       <w:r>
         <w:rPr>

</xml_diff>